<commit_message>
Update  Phase 6 document formatting
</commit_message>
<xml_diff>
--- a/Phase 6 - Project Testing/Phase 6 - Project Testing.docx
+++ b/Phase 6 - Project Testing/Phase 6 - Project Testing.docx
@@ -6,14 +6,20 @@
       <w:pPr>
         <w:jc w:val="center"/>
         <w:rPr>
+          <w:rFonts w:ascii="Times New Roman" w:hAnsi="Times New Roman" w:cs="Times New Roman"/>
           <w:b/>
           <w:bCs/>
-        </w:rPr>
-      </w:pPr>
-      <w:r>
-        <w:rPr>
+          <w:sz w:val="32"/>
+          <w:szCs w:val="32"/>
+        </w:rPr>
+      </w:pPr>
+      <w:r>
+        <w:rPr>
+          <w:rFonts w:ascii="Times New Roman" w:hAnsi="Times New Roman" w:cs="Times New Roman"/>
           <w:b/>
           <w:bCs/>
+          <w:sz w:val="32"/>
+          <w:szCs w:val="32"/>
         </w:rPr>
         <w:t>Phase 6 – Project Testing</w:t>
       </w:r>
@@ -21,11 +27,19 @@
     <w:p>
       <w:pPr>
         <w:jc w:val="center"/>
-      </w:pPr>
-      <w:r>
-        <w:rPr>
+        <w:rPr>
+          <w:rFonts w:ascii="Times New Roman" w:hAnsi="Times New Roman" w:cs="Times New Roman"/>
+          <w:sz w:val="32"/>
+          <w:szCs w:val="32"/>
+        </w:rPr>
+      </w:pPr>
+      <w:r>
+        <w:rPr>
+          <w:rFonts w:ascii="Times New Roman" w:hAnsi="Times New Roman" w:cs="Times New Roman"/>
           <w:b/>
           <w:bCs/>
+          <w:sz w:val="32"/>
+          <w:szCs w:val="32"/>
         </w:rPr>
         <w:t>Script-Controlled ACL – Restrict Record Access Based on Field Value</w:t>
       </w:r>
@@ -33,34 +47,55 @@
     <w:p>
       <w:pPr>
         <w:rPr>
+          <w:rFonts w:ascii="Times New Roman" w:hAnsi="Times New Roman" w:cs="Times New Roman"/>
           <w:b/>
           <w:bCs/>
-        </w:rPr>
-      </w:pPr>
-      <w:r>
-        <w:rPr>
+          <w:sz w:val="28"/>
+          <w:szCs w:val="28"/>
+        </w:rPr>
+      </w:pPr>
+      <w:r>
+        <w:rPr>
+          <w:rFonts w:ascii="Times New Roman" w:hAnsi="Times New Roman" w:cs="Times New Roman"/>
           <w:b/>
           <w:bCs/>
+          <w:sz w:val="28"/>
+          <w:szCs w:val="28"/>
         </w:rPr>
         <w:t>1. READ ACL Testing</w:t>
       </w:r>
     </w:p>
     <w:p>
-      <w:r>
+      <w:pPr>
+        <w:rPr>
+          <w:rFonts w:ascii="Times New Roman" w:hAnsi="Times New Roman" w:cs="Times New Roman"/>
+        </w:rPr>
+      </w:pPr>
+      <w:r>
+        <w:rPr>
+          <w:rFonts w:ascii="Times New Roman" w:hAnsi="Times New Roman" w:cs="Times New Roman"/>
+        </w:rPr>
         <w:t xml:space="preserve">The EEE User was </w:t>
       </w:r>
       <w:proofErr w:type="gramStart"/>
       <w:r>
+        <w:rPr>
+          <w:rFonts w:ascii="Times New Roman" w:hAnsi="Times New Roman" w:cs="Times New Roman"/>
+        </w:rPr>
         <w:t>impersonated</w:t>
       </w:r>
       <w:proofErr w:type="gramEnd"/>
       <w:r>
+        <w:rPr>
+          <w:rFonts w:ascii="Times New Roman" w:hAnsi="Times New Roman" w:cs="Times New Roman"/>
+        </w:rPr>
         <w:t xml:space="preserve"> and the Student Records list was opened using:</w:t>
       </w:r>
     </w:p>
     <w:p>
       <w:pPr>
         <w:rPr>
+          <w:rFonts w:ascii="Times New Roman" w:hAnsi="Times New Roman" w:cs="Times New Roman"/>
           <w:b/>
           <w:bCs/>
         </w:rPr>
@@ -68,6 +103,7 @@
       <w:proofErr w:type="spellStart"/>
       <w:r>
         <w:rPr>
+          <w:rFonts w:ascii="Times New Roman" w:hAnsi="Times New Roman" w:cs="Times New Roman"/>
           <w:b/>
           <w:bCs/>
         </w:rPr>
@@ -76,6 +112,7 @@
       <w:proofErr w:type="gramStart"/>
       <w:r>
         <w:rPr>
+          <w:rFonts w:ascii="Times New Roman" w:hAnsi="Times New Roman" w:cs="Times New Roman"/>
           <w:b/>
           <w:bCs/>
         </w:rPr>
@@ -85,7 +122,16 @@
       <w:proofErr w:type="gramEnd"/>
     </w:p>
     <w:p>
-      <w:r>
+      <w:pPr>
+        <w:rPr>
+          <w:rFonts w:ascii="Times New Roman" w:hAnsi="Times New Roman" w:cs="Times New Roman"/>
+        </w:rPr>
+      </w:pPr>
+      <w:r>
+        <w:rPr>
+          <w:rFonts w:ascii="Times New Roman" w:hAnsi="Times New Roman" w:cs="Times New Roman"/>
+          <w:noProof/>
+        </w:rPr>
         <w:drawing>
           <wp:inline distT="0" distB="0" distL="0" distR="0" wp14:anchorId="7CABC8A7" wp14:editId="0A8BF695">
             <wp:extent cx="5731510" cy="3020695"/>
@@ -124,7 +170,16 @@
       </w:r>
     </w:p>
     <w:p>
-      <w:r>
+      <w:pPr>
+        <w:rPr>
+          <w:rFonts w:ascii="Times New Roman" w:hAnsi="Times New Roman" w:cs="Times New Roman"/>
+        </w:rPr>
+      </w:pPr>
+      <w:r>
+        <w:rPr>
+          <w:rFonts w:ascii="Times New Roman" w:hAnsi="Times New Roman" w:cs="Times New Roman"/>
+          <w:noProof/>
+        </w:rPr>
         <w:drawing>
           <wp:inline distT="0" distB="0" distL="0" distR="0" wp14:anchorId="331EBCBA" wp14:editId="35652947">
             <wp:extent cx="5731510" cy="3020695"/>
@@ -165,20 +220,57 @@
     <w:p>
       <w:pPr>
         <w:rPr>
+          <w:rFonts w:ascii="Times New Roman" w:hAnsi="Times New Roman" w:cs="Times New Roman"/>
           <w:b/>
           <w:bCs/>
-        </w:rPr>
-      </w:pPr>
-      <w:r>
-        <w:rPr>
+          <w:sz w:val="28"/>
+          <w:szCs w:val="28"/>
+        </w:rPr>
+      </w:pPr>
+    </w:p>
+    <w:p>
+      <w:pPr>
+        <w:rPr>
+          <w:rFonts w:ascii="Times New Roman" w:hAnsi="Times New Roman" w:cs="Times New Roman"/>
           <w:b/>
           <w:bCs/>
-        </w:rPr>
+          <w:sz w:val="28"/>
+          <w:szCs w:val="28"/>
+        </w:rPr>
+      </w:pPr>
+    </w:p>
+    <w:p>
+      <w:pPr>
+        <w:rPr>
+          <w:rFonts w:ascii="Times New Roman" w:hAnsi="Times New Roman" w:cs="Times New Roman"/>
+          <w:b/>
+          <w:bCs/>
+          <w:sz w:val="28"/>
+          <w:szCs w:val="28"/>
+        </w:rPr>
+      </w:pPr>
+      <w:r>
+        <w:rPr>
+          <w:rFonts w:ascii="Times New Roman" w:hAnsi="Times New Roman" w:cs="Times New Roman"/>
+          <w:b/>
+          <w:bCs/>
+          <w:sz w:val="28"/>
+          <w:szCs w:val="28"/>
+        </w:rPr>
+        <w:lastRenderedPageBreak/>
         <w:t>2. READ ACL Verification</w:t>
       </w:r>
     </w:p>
     <w:p>
-      <w:r>
+      <w:pPr>
+        <w:rPr>
+          <w:rFonts w:ascii="Times New Roman" w:hAnsi="Times New Roman" w:cs="Times New Roman"/>
+        </w:rPr>
+      </w:pPr>
+      <w:r>
+        <w:rPr>
+          <w:rFonts w:ascii="Times New Roman" w:hAnsi="Times New Roman" w:cs="Times New Roman"/>
+        </w:rPr>
         <w:t>The following results were verified:</w:t>
       </w:r>
     </w:p>
@@ -188,8 +280,14 @@
           <w:ilvl w:val="0"/>
           <w:numId w:val="1"/>
         </w:numPr>
-      </w:pPr>
-      <w:r>
+        <w:rPr>
+          <w:rFonts w:ascii="Times New Roman" w:hAnsi="Times New Roman" w:cs="Times New Roman"/>
+        </w:rPr>
+      </w:pPr>
+      <w:r>
+        <w:rPr>
+          <w:rFonts w:ascii="Times New Roman" w:hAnsi="Times New Roman" w:cs="Times New Roman"/>
+        </w:rPr>
         <w:t>A user with the bb1 role can view EEE branch records.</w:t>
       </w:r>
     </w:p>
@@ -199,9 +297,14 @@
           <w:ilvl w:val="0"/>
           <w:numId w:val="1"/>
         </w:numPr>
-      </w:pPr>
-      <w:r>
-        <w:lastRenderedPageBreak/>
+        <w:rPr>
+          <w:rFonts w:ascii="Times New Roman" w:hAnsi="Times New Roman" w:cs="Times New Roman"/>
+        </w:rPr>
+      </w:pPr>
+      <w:r>
+        <w:rPr>
+          <w:rFonts w:ascii="Times New Roman" w:hAnsi="Times New Roman" w:cs="Times New Roman"/>
+        </w:rPr>
         <w:t>A user without the required role cannot view records.</w:t>
       </w:r>
     </w:p>
@@ -211,16 +314,29 @@
           <w:ilvl w:val="0"/>
           <w:numId w:val="1"/>
         </w:numPr>
-      </w:pPr>
-      <w:r>
+        <w:rPr>
+          <w:rFonts w:ascii="Times New Roman" w:hAnsi="Times New Roman" w:cs="Times New Roman"/>
+        </w:rPr>
+      </w:pPr>
+      <w:r>
+        <w:rPr>
+          <w:rFonts w:ascii="Times New Roman" w:hAnsi="Times New Roman" w:cs="Times New Roman"/>
+        </w:rPr>
         <w:t>An administrator can view all records regardless of branch.</w:t>
       </w:r>
     </w:p>
     <w:p>
       <w:pPr>
         <w:ind w:left="720"/>
-      </w:pPr>
-      <w:r>
+        <w:rPr>
+          <w:rFonts w:ascii="Times New Roman" w:hAnsi="Times New Roman" w:cs="Times New Roman"/>
+        </w:rPr>
+      </w:pPr>
+      <w:r>
+        <w:rPr>
+          <w:rFonts w:ascii="Times New Roman" w:hAnsi="Times New Roman" w:cs="Times New Roman"/>
+          <w:noProof/>
+        </w:rPr>
         <w:drawing>
           <wp:inline distT="0" distB="0" distL="0" distR="0" wp14:anchorId="2F7F747E" wp14:editId="0574D68B">
             <wp:extent cx="5731510" cy="3020695"/>
@@ -261,25 +377,42 @@
     <w:p>
       <w:pPr>
         <w:ind w:left="720"/>
-      </w:pPr>
-    </w:p>
-    <w:p>
-      <w:pPr>
-        <w:rPr>
+        <w:rPr>
+          <w:rFonts w:ascii="Times New Roman" w:hAnsi="Times New Roman" w:cs="Times New Roman"/>
+        </w:rPr>
+      </w:pPr>
+    </w:p>
+    <w:p>
+      <w:pPr>
+        <w:rPr>
+          <w:rFonts w:ascii="Times New Roman" w:hAnsi="Times New Roman" w:cs="Times New Roman"/>
           <w:b/>
           <w:bCs/>
-        </w:rPr>
-      </w:pPr>
-      <w:r>
-        <w:rPr>
+          <w:sz w:val="28"/>
+          <w:szCs w:val="28"/>
+        </w:rPr>
+      </w:pPr>
+      <w:r>
+        <w:rPr>
+          <w:rFonts w:ascii="Times New Roman" w:hAnsi="Times New Roman" w:cs="Times New Roman"/>
           <w:b/>
           <w:bCs/>
+          <w:sz w:val="28"/>
+          <w:szCs w:val="28"/>
         </w:rPr>
         <w:t>3. CREATE ACL Testing</w:t>
       </w:r>
     </w:p>
     <w:p>
-      <w:r>
+      <w:pPr>
+        <w:rPr>
+          <w:rFonts w:ascii="Times New Roman" w:hAnsi="Times New Roman" w:cs="Times New Roman"/>
+        </w:rPr>
+      </w:pPr>
+      <w:r>
+        <w:rPr>
+          <w:rFonts w:ascii="Times New Roman" w:hAnsi="Times New Roman" w:cs="Times New Roman"/>
+        </w:rPr>
         <w:t>The CREATE ACL was tested using a user with:</w:t>
       </w:r>
     </w:p>
@@ -289,8 +422,14 @@
           <w:ilvl w:val="0"/>
           <w:numId w:val="2"/>
         </w:numPr>
-      </w:pPr>
-      <w:r>
+        <w:rPr>
+          <w:rFonts w:ascii="Times New Roman" w:hAnsi="Times New Roman" w:cs="Times New Roman"/>
+        </w:rPr>
+      </w:pPr>
+      <w:r>
+        <w:rPr>
+          <w:rFonts w:ascii="Times New Roman" w:hAnsi="Times New Roman" w:cs="Times New Roman"/>
+        </w:rPr>
         <w:t>bb1</w:t>
       </w:r>
     </w:p>
@@ -300,28 +439,56 @@
           <w:ilvl w:val="0"/>
           <w:numId w:val="2"/>
         </w:numPr>
-      </w:pPr>
-      <w:r>
+        <w:rPr>
+          <w:rFonts w:ascii="Times New Roman" w:hAnsi="Times New Roman" w:cs="Times New Roman"/>
+        </w:rPr>
+      </w:pPr>
+      <w:r>
+        <w:rPr>
+          <w:rFonts w:ascii="Times New Roman" w:hAnsi="Times New Roman" w:cs="Times New Roman"/>
+        </w:rPr>
         <w:t>bb2</w:t>
       </w:r>
     </w:p>
     <w:p>
-      <w:r>
+      <w:pPr>
+        <w:rPr>
+          <w:rFonts w:ascii="Times New Roman" w:hAnsi="Times New Roman" w:cs="Times New Roman"/>
+        </w:rPr>
+      </w:pPr>
+      <w:r>
+        <w:rPr>
+          <w:rFonts w:ascii="Times New Roman" w:hAnsi="Times New Roman" w:cs="Times New Roman"/>
+        </w:rPr>
         <w:t xml:space="preserve">The user should be able to view EEE branch records and access the </w:t>
       </w:r>
       <w:r>
         <w:rPr>
+          <w:rFonts w:ascii="Times New Roman" w:hAnsi="Times New Roman" w:cs="Times New Roman"/>
           <w:b/>
           <w:bCs/>
         </w:rPr>
         <w:t>New</w:t>
       </w:r>
       <w:r>
+        <w:rPr>
+          <w:rFonts w:ascii="Times New Roman" w:hAnsi="Times New Roman" w:cs="Times New Roman"/>
+        </w:rPr>
         <w:t xml:space="preserve"> button.</w:t>
       </w:r>
     </w:p>
     <w:p>
-      <w:r>
+      <w:pPr>
+        <w:rPr>
+          <w:rFonts w:ascii="Times New Roman" w:hAnsi="Times New Roman" w:cs="Times New Roman"/>
+        </w:rPr>
+      </w:pPr>
+      <w:r>
+        <w:rPr>
+          <w:rFonts w:ascii="Times New Roman" w:hAnsi="Times New Roman" w:cs="Times New Roman"/>
+          <w:noProof/>
+        </w:rPr>
+        <w:lastRenderedPageBreak/>
         <w:drawing>
           <wp:inline distT="0" distB="0" distL="0" distR="0" wp14:anchorId="47182F9D" wp14:editId="01BC3A3F">
             <wp:extent cx="5731510" cy="3020695"/>
@@ -362,21 +529,34 @@
     <w:p>
       <w:pPr>
         <w:rPr>
+          <w:rFonts w:ascii="Times New Roman" w:hAnsi="Times New Roman" w:cs="Times New Roman"/>
           <w:b/>
           <w:bCs/>
-        </w:rPr>
-      </w:pPr>
-      <w:r>
-        <w:rPr>
+          <w:sz w:val="28"/>
+          <w:szCs w:val="28"/>
+        </w:rPr>
+      </w:pPr>
+      <w:r>
+        <w:rPr>
+          <w:rFonts w:ascii="Times New Roman" w:hAnsi="Times New Roman" w:cs="Times New Roman"/>
           <w:b/>
           <w:bCs/>
-        </w:rPr>
-        <w:lastRenderedPageBreak/>
+          <w:sz w:val="28"/>
+          <w:szCs w:val="28"/>
+        </w:rPr>
         <w:t>4. WRITE ACL Testing</w:t>
       </w:r>
     </w:p>
     <w:p>
-      <w:r>
+      <w:pPr>
+        <w:rPr>
+          <w:rFonts w:ascii="Times New Roman" w:hAnsi="Times New Roman" w:cs="Times New Roman"/>
+        </w:rPr>
+      </w:pPr>
+      <w:r>
+        <w:rPr>
+          <w:rFonts w:ascii="Times New Roman" w:hAnsi="Times New Roman" w:cs="Times New Roman"/>
+        </w:rPr>
         <w:t>The WRITE ACL was tested using a user with:</w:t>
       </w:r>
     </w:p>
@@ -386,8 +566,14 @@
           <w:ilvl w:val="0"/>
           <w:numId w:val="3"/>
         </w:numPr>
-      </w:pPr>
-      <w:r>
+        <w:rPr>
+          <w:rFonts w:ascii="Times New Roman" w:hAnsi="Times New Roman" w:cs="Times New Roman"/>
+        </w:rPr>
+      </w:pPr>
+      <w:r>
+        <w:rPr>
+          <w:rFonts w:ascii="Times New Roman" w:hAnsi="Times New Roman" w:cs="Times New Roman"/>
+        </w:rPr>
         <w:t>bb1</w:t>
       </w:r>
     </w:p>
@@ -397,8 +583,14 @@
           <w:ilvl w:val="0"/>
           <w:numId w:val="3"/>
         </w:numPr>
-      </w:pPr>
-      <w:r>
+        <w:rPr>
+          <w:rFonts w:ascii="Times New Roman" w:hAnsi="Times New Roman" w:cs="Times New Roman"/>
+        </w:rPr>
+      </w:pPr>
+      <w:r>
+        <w:rPr>
+          <w:rFonts w:ascii="Times New Roman" w:hAnsi="Times New Roman" w:cs="Times New Roman"/>
+        </w:rPr>
         <w:t>bb2</w:t>
       </w:r>
     </w:p>
@@ -408,18 +600,41 @@
           <w:ilvl w:val="0"/>
           <w:numId w:val="3"/>
         </w:numPr>
-      </w:pPr>
-      <w:r>
+        <w:rPr>
+          <w:rFonts w:ascii="Times New Roman" w:hAnsi="Times New Roman" w:cs="Times New Roman"/>
+        </w:rPr>
+      </w:pPr>
+      <w:r>
+        <w:rPr>
+          <w:rFonts w:ascii="Times New Roman" w:hAnsi="Times New Roman" w:cs="Times New Roman"/>
+        </w:rPr>
         <w:t>bb3</w:t>
       </w:r>
     </w:p>
     <w:p>
-      <w:r>
+      <w:pPr>
+        <w:rPr>
+          <w:rFonts w:ascii="Times New Roman" w:hAnsi="Times New Roman" w:cs="Times New Roman"/>
+        </w:rPr>
+      </w:pPr>
+      <w:r>
+        <w:rPr>
+          <w:rFonts w:ascii="Times New Roman" w:hAnsi="Times New Roman" w:cs="Times New Roman"/>
+        </w:rPr>
         <w:t>The user should be able to view and edit EEE branch records along with the New button.</w:t>
       </w:r>
     </w:p>
     <w:p>
-      <w:r>
+      <w:pPr>
+        <w:rPr>
+          <w:rFonts w:ascii="Times New Roman" w:hAnsi="Times New Roman" w:cs="Times New Roman"/>
+        </w:rPr>
+      </w:pPr>
+      <w:r>
+        <w:rPr>
+          <w:rFonts w:ascii="Times New Roman" w:hAnsi="Times New Roman" w:cs="Times New Roman"/>
+          <w:noProof/>
+        </w:rPr>
         <w:drawing>
           <wp:inline distT="0" distB="0" distL="0" distR="0" wp14:anchorId="631FBBB0" wp14:editId="5C7D5E72">
             <wp:extent cx="5731510" cy="3020695"/>
@@ -460,20 +675,57 @@
     <w:p>
       <w:pPr>
         <w:rPr>
+          <w:rFonts w:ascii="Times New Roman" w:hAnsi="Times New Roman" w:cs="Times New Roman"/>
           <w:b/>
           <w:bCs/>
-        </w:rPr>
-      </w:pPr>
-      <w:r>
-        <w:rPr>
+          <w:sz w:val="28"/>
+          <w:szCs w:val="28"/>
+        </w:rPr>
+      </w:pPr>
+    </w:p>
+    <w:p>
+      <w:pPr>
+        <w:rPr>
+          <w:rFonts w:ascii="Times New Roman" w:hAnsi="Times New Roman" w:cs="Times New Roman"/>
           <w:b/>
           <w:bCs/>
-        </w:rPr>
+          <w:sz w:val="28"/>
+          <w:szCs w:val="28"/>
+        </w:rPr>
+      </w:pPr>
+    </w:p>
+    <w:p>
+      <w:pPr>
+        <w:rPr>
+          <w:rFonts w:ascii="Times New Roman" w:hAnsi="Times New Roman" w:cs="Times New Roman"/>
+          <w:b/>
+          <w:bCs/>
+          <w:sz w:val="28"/>
+          <w:szCs w:val="28"/>
+        </w:rPr>
+      </w:pPr>
+      <w:r>
+        <w:rPr>
+          <w:rFonts w:ascii="Times New Roman" w:hAnsi="Times New Roman" w:cs="Times New Roman"/>
+          <w:b/>
+          <w:bCs/>
+          <w:sz w:val="28"/>
+          <w:szCs w:val="28"/>
+        </w:rPr>
+        <w:lastRenderedPageBreak/>
         <w:t>5. DELETE ACL Testing</w:t>
       </w:r>
     </w:p>
     <w:p>
-      <w:r>
+      <w:pPr>
+        <w:rPr>
+          <w:rFonts w:ascii="Times New Roman" w:hAnsi="Times New Roman" w:cs="Times New Roman"/>
+        </w:rPr>
+      </w:pPr>
+      <w:r>
+        <w:rPr>
+          <w:rFonts w:ascii="Times New Roman" w:hAnsi="Times New Roman" w:cs="Times New Roman"/>
+        </w:rPr>
         <w:t>The DELETE ACL was tested using a user with:</w:t>
       </w:r>
     </w:p>
@@ -483,8 +735,14 @@
           <w:ilvl w:val="0"/>
           <w:numId w:val="4"/>
         </w:numPr>
-      </w:pPr>
-      <w:r>
+        <w:rPr>
+          <w:rFonts w:ascii="Times New Roman" w:hAnsi="Times New Roman" w:cs="Times New Roman"/>
+        </w:rPr>
+      </w:pPr>
+      <w:r>
+        <w:rPr>
+          <w:rFonts w:ascii="Times New Roman" w:hAnsi="Times New Roman" w:cs="Times New Roman"/>
+        </w:rPr>
         <w:t>bb1</w:t>
       </w:r>
     </w:p>
@@ -494,8 +752,14 @@
           <w:ilvl w:val="0"/>
           <w:numId w:val="4"/>
         </w:numPr>
-      </w:pPr>
-      <w:r>
+        <w:rPr>
+          <w:rFonts w:ascii="Times New Roman" w:hAnsi="Times New Roman" w:cs="Times New Roman"/>
+        </w:rPr>
+      </w:pPr>
+      <w:r>
+        <w:rPr>
+          <w:rFonts w:ascii="Times New Roman" w:hAnsi="Times New Roman" w:cs="Times New Roman"/>
+        </w:rPr>
         <w:t>bb2</w:t>
       </w:r>
     </w:p>
@@ -505,8 +769,14 @@
           <w:ilvl w:val="0"/>
           <w:numId w:val="4"/>
         </w:numPr>
-      </w:pPr>
-      <w:r>
+        <w:rPr>
+          <w:rFonts w:ascii="Times New Roman" w:hAnsi="Times New Roman" w:cs="Times New Roman"/>
+        </w:rPr>
+      </w:pPr>
+      <w:r>
+        <w:rPr>
+          <w:rFonts w:ascii="Times New Roman" w:hAnsi="Times New Roman" w:cs="Times New Roman"/>
+        </w:rPr>
         <w:t>bb3</w:t>
       </w:r>
     </w:p>
@@ -516,17 +786,29 @@
           <w:ilvl w:val="0"/>
           <w:numId w:val="4"/>
         </w:numPr>
-      </w:pPr>
-      <w:r>
+        <w:rPr>
+          <w:rFonts w:ascii="Times New Roman" w:hAnsi="Times New Roman" w:cs="Times New Roman"/>
+        </w:rPr>
+      </w:pPr>
+      <w:r>
+        <w:rPr>
+          <w:rFonts w:ascii="Times New Roman" w:hAnsi="Times New Roman" w:cs="Times New Roman"/>
+        </w:rPr>
         <w:t>bb4</w:t>
       </w:r>
     </w:p>
     <w:p>
       <w:pPr>
         <w:ind w:left="720"/>
-      </w:pPr>
-      <w:r>
-        <w:lastRenderedPageBreak/>
+        <w:rPr>
+          <w:rFonts w:ascii="Times New Roman" w:hAnsi="Times New Roman" w:cs="Times New Roman"/>
+        </w:rPr>
+      </w:pPr>
+      <w:r>
+        <w:rPr>
+          <w:rFonts w:ascii="Times New Roman" w:hAnsi="Times New Roman" w:cs="Times New Roman"/>
+          <w:noProof/>
+        </w:rPr>
         <w:drawing>
           <wp:inline distT="0" distB="0" distL="0" distR="0" wp14:anchorId="33566637" wp14:editId="2C6605B8">
             <wp:extent cx="5731510" cy="3020695"/>
@@ -565,7 +847,15 @@
       </w:r>
     </w:p>
     <w:p>
-      <w:r>
+      <w:pPr>
+        <w:rPr>
+          <w:rFonts w:ascii="Times New Roman" w:hAnsi="Times New Roman" w:cs="Times New Roman"/>
+        </w:rPr>
+      </w:pPr>
+      <w:r>
+        <w:rPr>
+          <w:rFonts w:ascii="Times New Roman" w:hAnsi="Times New Roman" w:cs="Times New Roman"/>
+        </w:rPr>
         <w:t>The user should be able to:</w:t>
       </w:r>
     </w:p>
@@ -575,8 +865,14 @@
           <w:ilvl w:val="0"/>
           <w:numId w:val="5"/>
         </w:numPr>
-      </w:pPr>
-      <w:r>
+        <w:rPr>
+          <w:rFonts w:ascii="Times New Roman" w:hAnsi="Times New Roman" w:cs="Times New Roman"/>
+        </w:rPr>
+      </w:pPr>
+      <w:r>
+        <w:rPr>
+          <w:rFonts w:ascii="Times New Roman" w:hAnsi="Times New Roman" w:cs="Times New Roman"/>
+        </w:rPr>
         <w:t>View EEE records</w:t>
       </w:r>
     </w:p>
@@ -586,8 +882,14 @@
           <w:ilvl w:val="0"/>
           <w:numId w:val="5"/>
         </w:numPr>
-      </w:pPr>
-      <w:r>
+        <w:rPr>
+          <w:rFonts w:ascii="Times New Roman" w:hAnsi="Times New Roman" w:cs="Times New Roman"/>
+        </w:rPr>
+      </w:pPr>
+      <w:r>
+        <w:rPr>
+          <w:rFonts w:ascii="Times New Roman" w:hAnsi="Times New Roman" w:cs="Times New Roman"/>
+        </w:rPr>
         <w:t>Create records</w:t>
       </w:r>
     </w:p>
@@ -597,8 +899,14 @@
           <w:ilvl w:val="0"/>
           <w:numId w:val="5"/>
         </w:numPr>
-      </w:pPr>
-      <w:r>
+        <w:rPr>
+          <w:rFonts w:ascii="Times New Roman" w:hAnsi="Times New Roman" w:cs="Times New Roman"/>
+        </w:rPr>
+      </w:pPr>
+      <w:r>
+        <w:rPr>
+          <w:rFonts w:ascii="Times New Roman" w:hAnsi="Times New Roman" w:cs="Times New Roman"/>
+        </w:rPr>
         <w:t>Edit records</w:t>
       </w:r>
     </w:p>
@@ -608,38 +916,76 @@
           <w:ilvl w:val="0"/>
           <w:numId w:val="5"/>
         </w:numPr>
-      </w:pPr>
-      <w:r>
+        <w:rPr>
+          <w:rFonts w:ascii="Times New Roman" w:hAnsi="Times New Roman" w:cs="Times New Roman"/>
+        </w:rPr>
+      </w:pPr>
+      <w:r>
+        <w:rPr>
+          <w:rFonts w:ascii="Times New Roman" w:hAnsi="Times New Roman" w:cs="Times New Roman"/>
+        </w:rPr>
         <w:t>Delete records</w:t>
       </w:r>
     </w:p>
     <w:p>
       <w:pPr>
         <w:rPr>
+          <w:rFonts w:ascii="Times New Roman" w:hAnsi="Times New Roman" w:cs="Times New Roman"/>
           <w:b/>
           <w:bCs/>
-        </w:rPr>
-      </w:pPr>
-      <w:r>
-        <w:rPr>
+          <w:sz w:val="28"/>
+          <w:szCs w:val="28"/>
+        </w:rPr>
+      </w:pPr>
+      <w:r>
+        <w:rPr>
+          <w:rFonts w:ascii="Times New Roman" w:hAnsi="Times New Roman" w:cs="Times New Roman"/>
           <w:b/>
           <w:bCs/>
+          <w:sz w:val="28"/>
+          <w:szCs w:val="28"/>
         </w:rPr>
         <w:t>6. Admin Testing</w:t>
       </w:r>
     </w:p>
     <w:p>
-      <w:r>
+      <w:pPr>
+        <w:rPr>
+          <w:rFonts w:ascii="Times New Roman" w:hAnsi="Times New Roman" w:cs="Times New Roman"/>
+        </w:rPr>
+      </w:pPr>
+      <w:r>
+        <w:rPr>
+          <w:rFonts w:ascii="Times New Roman" w:hAnsi="Times New Roman" w:cs="Times New Roman"/>
+        </w:rPr>
         <w:t>The administrator was impersonated and the Student Records list was opened.</w:t>
       </w:r>
     </w:p>
     <w:p>
-      <w:r>
+      <w:pPr>
+        <w:rPr>
+          <w:rFonts w:ascii="Times New Roman" w:hAnsi="Times New Roman" w:cs="Times New Roman"/>
+        </w:rPr>
+      </w:pPr>
+      <w:r>
+        <w:rPr>
+          <w:rFonts w:ascii="Times New Roman" w:hAnsi="Times New Roman" w:cs="Times New Roman"/>
+        </w:rPr>
         <w:t>The administrator should be able to view all records regardless of the Branch value.</w:t>
       </w:r>
     </w:p>
     <w:p>
-      <w:r>
+      <w:pPr>
+        <w:rPr>
+          <w:rFonts w:ascii="Times New Roman" w:hAnsi="Times New Roman" w:cs="Times New Roman"/>
+        </w:rPr>
+      </w:pPr>
+      <w:r>
+        <w:rPr>
+          <w:rFonts w:ascii="Times New Roman" w:hAnsi="Times New Roman" w:cs="Times New Roman"/>
+          <w:noProof/>
+        </w:rPr>
+        <w:lastRenderedPageBreak/>
         <w:drawing>
           <wp:inline distT="0" distB="0" distL="0" distR="0" wp14:anchorId="60C63140" wp14:editId="5E4B8682">
             <wp:extent cx="5731510" cy="3020695"/>
@@ -680,21 +1026,34 @@
     <w:p>
       <w:pPr>
         <w:rPr>
+          <w:rFonts w:ascii="Times New Roman" w:hAnsi="Times New Roman" w:cs="Times New Roman"/>
           <w:b/>
           <w:bCs/>
-        </w:rPr>
-      </w:pPr>
-      <w:r>
-        <w:rPr>
+          <w:sz w:val="28"/>
+          <w:szCs w:val="28"/>
+        </w:rPr>
+      </w:pPr>
+      <w:r>
+        <w:rPr>
+          <w:rFonts w:ascii="Times New Roman" w:hAnsi="Times New Roman" w:cs="Times New Roman"/>
           <w:b/>
           <w:bCs/>
-        </w:rPr>
-        <w:lastRenderedPageBreak/>
+          <w:sz w:val="28"/>
+          <w:szCs w:val="28"/>
+        </w:rPr>
         <w:t>7. Testing Evidence</w:t>
       </w:r>
     </w:p>
     <w:p>
-      <w:r>
+      <w:pPr>
+        <w:rPr>
+          <w:rFonts w:ascii="Times New Roman" w:hAnsi="Times New Roman" w:cs="Times New Roman"/>
+        </w:rPr>
+      </w:pPr>
+      <w:r>
+        <w:rPr>
+          <w:rFonts w:ascii="Times New Roman" w:hAnsi="Times New Roman" w:cs="Times New Roman"/>
+        </w:rPr>
         <w:t>Screenshots should be added showing:</w:t>
       </w:r>
     </w:p>
@@ -704,8 +1063,14 @@
           <w:ilvl w:val="0"/>
           <w:numId w:val="6"/>
         </w:numPr>
-      </w:pPr>
-      <w:r>
+        <w:rPr>
+          <w:rFonts w:ascii="Times New Roman" w:hAnsi="Times New Roman" w:cs="Times New Roman"/>
+        </w:rPr>
+      </w:pPr>
+      <w:r>
+        <w:rPr>
+          <w:rFonts w:ascii="Times New Roman" w:hAnsi="Times New Roman" w:cs="Times New Roman"/>
+        </w:rPr>
         <w:t>EEE User impersonation</w:t>
       </w:r>
     </w:p>
@@ -715,8 +1080,14 @@
           <w:ilvl w:val="0"/>
           <w:numId w:val="6"/>
         </w:numPr>
-      </w:pPr>
-      <w:r>
+        <w:rPr>
+          <w:rFonts w:ascii="Times New Roman" w:hAnsi="Times New Roman" w:cs="Times New Roman"/>
+        </w:rPr>
+      </w:pPr>
+      <w:r>
+        <w:rPr>
+          <w:rFonts w:ascii="Times New Roman" w:hAnsi="Times New Roman" w:cs="Times New Roman"/>
+        </w:rPr>
         <w:t>EEE records</w:t>
       </w:r>
     </w:p>
@@ -726,8 +1097,14 @@
           <w:ilvl w:val="0"/>
           <w:numId w:val="6"/>
         </w:numPr>
-      </w:pPr>
-      <w:r>
+        <w:rPr>
+          <w:rFonts w:ascii="Times New Roman" w:hAnsi="Times New Roman" w:cs="Times New Roman"/>
+        </w:rPr>
+      </w:pPr>
+      <w:r>
+        <w:rPr>
+          <w:rFonts w:ascii="Times New Roman" w:hAnsi="Times New Roman" w:cs="Times New Roman"/>
+        </w:rPr>
         <w:t>Restricted access</w:t>
       </w:r>
     </w:p>
@@ -737,8 +1114,14 @@
           <w:ilvl w:val="0"/>
           <w:numId w:val="6"/>
         </w:numPr>
-      </w:pPr>
-      <w:r>
+        <w:rPr>
+          <w:rFonts w:ascii="Times New Roman" w:hAnsi="Times New Roman" w:cs="Times New Roman"/>
+        </w:rPr>
+      </w:pPr>
+      <w:r>
+        <w:rPr>
+          <w:rFonts w:ascii="Times New Roman" w:hAnsi="Times New Roman" w:cs="Times New Roman"/>
+        </w:rPr>
         <w:t>Admin access</w:t>
       </w:r>
     </w:p>
@@ -748,8 +1131,14 @@
           <w:ilvl w:val="0"/>
           <w:numId w:val="6"/>
         </w:numPr>
-      </w:pPr>
-      <w:r>
+        <w:rPr>
+          <w:rFonts w:ascii="Times New Roman" w:hAnsi="Times New Roman" w:cs="Times New Roman"/>
+        </w:rPr>
+      </w:pPr>
+      <w:r>
+        <w:rPr>
+          <w:rFonts w:ascii="Times New Roman" w:hAnsi="Times New Roman" w:cs="Times New Roman"/>
+        </w:rPr>
         <w:t>New button</w:t>
       </w:r>
     </w:p>
@@ -759,8 +1148,14 @@
           <w:ilvl w:val="0"/>
           <w:numId w:val="6"/>
         </w:numPr>
-      </w:pPr>
-      <w:r>
+        <w:rPr>
+          <w:rFonts w:ascii="Times New Roman" w:hAnsi="Times New Roman" w:cs="Times New Roman"/>
+        </w:rPr>
+      </w:pPr>
+      <w:r>
+        <w:rPr>
+          <w:rFonts w:ascii="Times New Roman" w:hAnsi="Times New Roman" w:cs="Times New Roman"/>
+        </w:rPr>
         <w:t>Edit access</w:t>
       </w:r>
     </w:p>
@@ -770,32 +1165,58 @@
           <w:ilvl w:val="0"/>
           <w:numId w:val="6"/>
         </w:numPr>
-      </w:pPr>
-      <w:r>
+        <w:rPr>
+          <w:rFonts w:ascii="Times New Roman" w:hAnsi="Times New Roman" w:cs="Times New Roman"/>
+        </w:rPr>
+      </w:pPr>
+      <w:r>
+        <w:rPr>
+          <w:rFonts w:ascii="Times New Roman" w:hAnsi="Times New Roman" w:cs="Times New Roman"/>
+        </w:rPr>
         <w:t>Delete access</w:t>
       </w:r>
     </w:p>
     <w:p>
       <w:pPr>
         <w:rPr>
+          <w:rFonts w:ascii="Times New Roman" w:hAnsi="Times New Roman" w:cs="Times New Roman"/>
           <w:b/>
           <w:bCs/>
-        </w:rPr>
-      </w:pPr>
-      <w:r>
-        <w:rPr>
+          <w:sz w:val="28"/>
+          <w:szCs w:val="28"/>
+        </w:rPr>
+      </w:pPr>
+      <w:r>
+        <w:rPr>
+          <w:rFonts w:ascii="Times New Roman" w:hAnsi="Times New Roman" w:cs="Times New Roman"/>
           <w:b/>
           <w:bCs/>
+          <w:sz w:val="28"/>
+          <w:szCs w:val="28"/>
         </w:rPr>
         <w:t>8. Testing Result</w:t>
       </w:r>
     </w:p>
     <w:p>
-      <w:r>
+      <w:pPr>
+        <w:rPr>
+          <w:rFonts w:ascii="Times New Roman" w:hAnsi="Times New Roman" w:cs="Times New Roman"/>
+        </w:rPr>
+      </w:pPr>
+      <w:r>
+        <w:rPr>
+          <w:rFonts w:ascii="Times New Roman" w:hAnsi="Times New Roman" w:cs="Times New Roman"/>
+        </w:rPr>
         <w:t>The testing verifies the behaviour of the configured READ, CREATE, WRITE and DELETE ACLs.</w:t>
       </w:r>
     </w:p>
-    <w:p/>
+    <w:p>
+      <w:pPr>
+        <w:rPr>
+          <w:rFonts w:ascii="Times New Roman" w:hAnsi="Times New Roman" w:cs="Times New Roman"/>
+        </w:rPr>
+      </w:pPr>
+    </w:p>
     <w:sectPr>
       <w:pgSz w:w="11906" w:h="16838"/>
       <w:pgMar w:top="1440" w:right="1440" w:bottom="1440" w:left="1440" w:header="708" w:footer="708" w:gutter="0"/>

</xml_diff>